<commit_message>
docs and data cleanup script
</commit_message>
<xml_diff>
--- a/Bitsight_VRM_Playwright_Suite_Documentation.docx
+++ b/Bitsight_VRM_Playwright_Suite_Documentation.docx
@@ -11,7 +11,6 @@
       <w:pPr>
         <w:jc w:val="center"/>
       </w:pPr>
-      <w:proofErr w:type="spellStart"/>
       <w:r>
         <w:rPr>
           <w:b/>
@@ -20,18 +19,7 @@
           <w:sz w:val="56"/>
           <w:szCs w:val="56"/>
         </w:rPr>
-        <w:t>Bitsight</w:t>
-      </w:r>
-      <w:proofErr w:type="spellEnd"/>
-      <w:r>
-        <w:rPr>
-          <w:b/>
-          <w:bCs/>
-          <w:color w:val="1F3864"/>
-          <w:sz w:val="56"/>
-          <w:szCs w:val="56"/>
-        </w:rPr>
-        <w:t xml:space="preserve"> VRM — ServiceNow</w:t>
+        <w:t xml:space="preserve">Bitsight VRM — ServiceNow</w:t>
       </w:r>
     </w:p>
     <w:p>
@@ -103,15 +91,7 @@
         <w:spacing w:after="160" w:line="300" w:lineRule="auto"/>
       </w:pPr>
       <w:r>
-        <w:t xml:space="preserve">Core functionality and API-level test automation for the </w:t>
-      </w:r>
-      <w:proofErr w:type="spellStart"/>
-      <w:r>
-        <w:t>Bitsight</w:t>
-      </w:r>
-      <w:proofErr w:type="spellEnd"/>
-      <w:r>
-        <w:t xml:space="preserve"> Vendor Risk Management (VRM) integration inside ServiceNow, built with Playwright.</w:t>
+        <w:t xml:space="preserve">Core functionality and API-level test automation for the Bitsight Vendor Risk Management (VRM) integration inside ServiceNow, built with Playwright.</w:t>
       </w:r>
     </w:p>
     <w:p>
@@ -119,23 +99,7 @@
         <w:spacing w:after="160" w:line="300" w:lineRule="auto"/>
       </w:pPr>
       <w:r>
-        <w:t xml:space="preserve">The suite logs into a ServiceNow instance, then drives the </w:t>
-      </w:r>
-      <w:proofErr w:type="spellStart"/>
-      <w:r>
-        <w:t>Bitsight</w:t>
-      </w:r>
-      <w:proofErr w:type="spellEnd"/>
-      <w:r>
-        <w:t xml:space="preserve"> application UI (Application Configuration, Portfolio, Alerts, Incidents, Dashboard, etc.) while cross-checking results against the ServiceNow and </w:t>
-      </w:r>
-      <w:proofErr w:type="spellStart"/>
-      <w:r>
-        <w:t>Bitsight</w:t>
-      </w:r>
-      <w:proofErr w:type="spellEnd"/>
-      <w:r>
-        <w:t xml:space="preserve"> REST APIs.</w:t>
+        <w:t xml:space="preserve">The suite logs into a ServiceNow instance, then drives the Bitsight application UI (Application Configuration, Portfolio, Alerts, Incidents, Dashboard, etc.) while cross-checking results against the ServiceNow and Bitsight REST APIs.</w:t>
       </w:r>
     </w:p>
     <w:p>
@@ -190,13 +154,8 @@
         </w:numPr>
         <w:spacing w:after="100"/>
       </w:pPr>
-      <w:proofErr w:type="spellStart"/>
-      <w:r>
-        <w:t>npm</w:t>
-      </w:r>
-      <w:proofErr w:type="spellEnd"/>
-      <w:r>
-        <w:t xml:space="preserve"> (comes bundled with Node.js)</w:t>
+      <w:r>
+        <w:t xml:space="preserve">npm (comes bundled with Node.js)</w:t>
       </w:r>
     </w:p>
     <w:p>
@@ -209,15 +168,7 @@
         <w:spacing w:after="100"/>
       </w:pPr>
       <w:r>
-        <w:t xml:space="preserve">Access to a ServiceNow instance with the </w:t>
-      </w:r>
-      <w:proofErr w:type="spellStart"/>
-      <w:r>
-        <w:t>Bitsight</w:t>
-      </w:r>
-      <w:proofErr w:type="spellEnd"/>
-      <w:r>
-        <w:t xml:space="preserve"> VRM application installed</w:t>
+        <w:t xml:space="preserve">Access to a ServiceNow instance with the Bitsight VRM application installed</w:t>
       </w:r>
     </w:p>
     <w:p>
@@ -230,15 +181,7 @@
         <w:spacing w:after="100"/>
       </w:pPr>
       <w:r>
-        <w:t xml:space="preserve">Valid </w:t>
-      </w:r>
-      <w:proofErr w:type="spellStart"/>
-      <w:r>
-        <w:t>Bitsight</w:t>
-      </w:r>
-      <w:proofErr w:type="spellEnd"/>
-      <w:r>
-        <w:t xml:space="preserve"> API tokens for each mode you plan to test (CM, VRM, CM+VRM)</w:t>
+        <w:t xml:space="preserve">Valid Bitsight API tokens for each mode you plan to test (CM, VRM, CM+VRM)</w:t>
       </w:r>
     </w:p>
     <w:p>
@@ -268,26 +211,10 @@
           <w:u w:val="single"/>
         </w:rPr>
       </w:pPr>
-      <w:proofErr w:type="gramStart"/>
-      <w:r>
-        <w:t>In order for</w:t>
-      </w:r>
-      <w:proofErr w:type="gramEnd"/>
-      <w:r>
-        <w:t xml:space="preserve"> some of the API functionality to work the </w:t>
-      </w:r>
-      <w:proofErr w:type="spellStart"/>
-      <w:r>
-        <w:t>vrm_admin</w:t>
-      </w:r>
-      <w:proofErr w:type="spellEnd"/>
-      <w:r>
-        <w:t xml:space="preserve"> must have this role </w:t>
-      </w:r>
-      <w:r>
+      <w:r>
+        <w:t xml:space="preserve">In order for some of the API functionality to work the vrm_admin must have this role </w:t>
         <w:br/>
       </w:r>
-      <w:proofErr w:type="spellStart"/>
       <w:r>
         <w:rPr>
           <w:b/>
@@ -296,7 +223,6 @@
         </w:rPr>
         <w:t>snc_platform_rest_api_access</w:t>
       </w:r>
-      <w:proofErr w:type="spellEnd"/>
     </w:p>
     <w:p>
       <w:pPr>
@@ -355,23 +281,13 @@
             </w:r>
           </w:p>
           <w:p>
-            <w:proofErr w:type="spellStart"/>
-            <w:r>
-              <w:rPr>
-                <w:rFonts w:ascii="Consolas" w:eastAsia="Consolas" w:hAnsi="Consolas" w:cs="Consolas"/>
-                <w:sz w:val="20"/>
-                <w:szCs w:val="20"/>
-              </w:rPr>
-              <w:t>npm</w:t>
-            </w:r>
-            <w:proofErr w:type="spellEnd"/>
-            <w:r>
-              <w:rPr>
-                <w:rFonts w:ascii="Consolas" w:eastAsia="Consolas" w:hAnsi="Consolas" w:cs="Consolas"/>
-                <w:sz w:val="20"/>
-                <w:szCs w:val="20"/>
-              </w:rPr>
-              <w:t xml:space="preserve"> -v</w:t>
+            <w:r>
+              <w:rPr>
+                <w:rFonts w:ascii="Consolas" w:eastAsia="Consolas" w:hAnsi="Consolas" w:cs="Consolas"/>
+                <w:sz w:val="20"/>
+                <w:szCs w:val="20"/>
+              </w:rPr>
+              <w:t xml:space="preserve">npm -v</w:t>
             </w:r>
           </w:p>
         </w:tc>
@@ -447,23 +363,7 @@
                 <w:sz w:val="20"/>
                 <w:szCs w:val="20"/>
               </w:rPr>
-              <w:t>git clone &lt;</w:t>
-            </w:r>
-            <w:r>
-              <w:rPr>
-                <w:rFonts w:ascii="Consolas" w:eastAsia="Consolas" w:hAnsi="Consolas" w:cs="Consolas"/>
-                <w:sz w:val="20"/>
-                <w:szCs w:val="20"/>
-              </w:rPr>
-              <w:t>https://github.com/Branded-yuvraj/Bitsight_VRM_automated_tests.git</w:t>
-            </w:r>
-            <w:r>
-              <w:rPr>
-                <w:rFonts w:ascii="Consolas" w:eastAsia="Consolas" w:hAnsi="Consolas" w:cs="Consolas"/>
-                <w:sz w:val="20"/>
-                <w:szCs w:val="20"/>
-              </w:rPr>
-              <w:t>&gt;</w:t>
+              <w:t>git clone &lt;https://github.com/Branded-yuvraj/Bitsight_VRM_automated_tests.git&gt;</w:t>
             </w:r>
           </w:p>
           <w:p>
@@ -476,37 +376,17 @@
                 <w:sz w:val="20"/>
                 <w:szCs w:val="20"/>
               </w:rPr>
-              <w:t xml:space="preserve">cd </w:t>
-            </w:r>
-            <w:proofErr w:type="spellStart"/>
-            <w:r>
-              <w:rPr>
-                <w:rFonts w:ascii="Consolas" w:eastAsia="Consolas" w:hAnsi="Consolas" w:cs="Consolas"/>
-                <w:sz w:val="20"/>
-                <w:szCs w:val="20"/>
-              </w:rPr>
-              <w:t>bs_vrm_playwright</w:t>
-            </w:r>
-            <w:proofErr w:type="spellEnd"/>
-          </w:p>
-          <w:p>
-            <w:proofErr w:type="spellStart"/>
-            <w:r>
-              <w:rPr>
-                <w:rFonts w:ascii="Consolas" w:eastAsia="Consolas" w:hAnsi="Consolas" w:cs="Consolas"/>
-                <w:sz w:val="20"/>
-                <w:szCs w:val="20"/>
-              </w:rPr>
-              <w:t>npm</w:t>
-            </w:r>
-            <w:proofErr w:type="spellEnd"/>
-            <w:r>
-              <w:rPr>
-                <w:rFonts w:ascii="Consolas" w:eastAsia="Consolas" w:hAnsi="Consolas" w:cs="Consolas"/>
-                <w:sz w:val="20"/>
-                <w:szCs w:val="20"/>
-              </w:rPr>
-              <w:t xml:space="preserve"> install</w:t>
+              <w:t xml:space="preserve">cd bs_vrm_playwright</w:t>
+            </w:r>
+          </w:p>
+          <w:p>
+            <w:r>
+              <w:rPr>
+                <w:rFonts w:ascii="Consolas" w:eastAsia="Consolas" w:hAnsi="Consolas" w:cs="Consolas"/>
+                <w:sz w:val="20"/>
+                <w:szCs w:val="20"/>
+              </w:rPr>
+              <w:t xml:space="preserve">npm install</w:t>
             </w:r>
           </w:p>
         </w:tc>
@@ -556,34 +436,14 @@
             </w:tcMar>
           </w:tcPr>
           <w:p>
-            <w:proofErr w:type="spellStart"/>
-            <w:r>
-              <w:rPr>
-                <w:rFonts w:ascii="Consolas" w:eastAsia="Consolas" w:hAnsi="Consolas" w:cs="Consolas"/>
-                <w:sz w:val="20"/>
-                <w:szCs w:val="20"/>
-              </w:rPr>
-              <w:t>npx</w:t>
-            </w:r>
-            <w:proofErr w:type="spellEnd"/>
-            <w:r>
-              <w:rPr>
-                <w:rFonts w:ascii="Consolas" w:eastAsia="Consolas" w:hAnsi="Consolas" w:cs="Consolas"/>
-                <w:sz w:val="20"/>
-                <w:szCs w:val="20"/>
-              </w:rPr>
-              <w:t xml:space="preserve"> playwright </w:t>
-            </w:r>
-            <w:proofErr w:type="gramStart"/>
-            <w:r>
-              <w:rPr>
-                <w:rFonts w:ascii="Consolas" w:eastAsia="Consolas" w:hAnsi="Consolas" w:cs="Consolas"/>
-                <w:sz w:val="20"/>
-                <w:szCs w:val="20"/>
-              </w:rPr>
-              <w:t>install</w:t>
-            </w:r>
-            <w:proofErr w:type="gramEnd"/>
+            <w:r>
+              <w:rPr>
+                <w:rFonts w:ascii="Consolas" w:eastAsia="Consolas" w:hAnsi="Consolas" w:cs="Consolas"/>
+                <w:sz w:val="20"/>
+                <w:szCs w:val="20"/>
+              </w:rPr>
+              <w:t xml:space="preserve">npx playwright install</w:t>
+            </w:r>
           </w:p>
         </w:tc>
       </w:tr>
@@ -616,15 +476,7 @@
         <w:spacing w:after="160" w:line="300" w:lineRule="auto"/>
       </w:pPr>
       <w:r>
-        <w:t xml:space="preserve">The tests read all credentials and instance details from a .env file — nothing is hardcoded. Create a file </w:t>
-      </w:r>
-      <w:proofErr w:type="gramStart"/>
-      <w:r>
-        <w:t>named .env</w:t>
-      </w:r>
-      <w:proofErr w:type="gramEnd"/>
-      <w:r>
-        <w:t xml:space="preserve"> in the project root and fill it in with your own values:</w:t>
+        <w:t xml:space="preserve">The tests read all credentials and instance details from a .env file — nothing is hardcoded. Create a file named .env in the project root and fill it in with your own values:</w:t>
       </w:r>
     </w:p>
     <w:tbl>
@@ -716,26 +568,16 @@
               <w:spacing w:after="40"/>
             </w:pPr>
             <w:r>
-              <w:t>VRM_USER_BASIC=</w:t>
-            </w:r>
-            <w:proofErr w:type="spellStart"/>
-            <w:r>
-              <w:t>abc</w:t>
-            </w:r>
-            <w:proofErr w:type="spellEnd"/>
+              <w:t>VRM_USER_BASIC=abc</w:t>
+            </w:r>
           </w:p>
           <w:p>
             <w:pPr>
               <w:spacing w:after="40"/>
             </w:pPr>
             <w:r>
-              <w:t>SN_REGULAR_USER=</w:t>
-            </w:r>
-            <w:proofErr w:type="spellStart"/>
-            <w:r>
-              <w:t>abc</w:t>
-            </w:r>
-            <w:proofErr w:type="spellEnd"/>
+              <w:t>SN_REGULAR_USER=abc</w:t>
+            </w:r>
           </w:p>
           <w:p>
             <w:pPr>
@@ -1013,7 +855,7 @@
           </w:p>
         </w:tc>
       </w:tr>
-      <w:tr>
+      <w:tr w14:paraId="07057C8A0">
         <w:tc>
           <w:tcPr>
             <w:tcW w:w="2200" w:type="dxa"/>
@@ -1025,13 +867,13 @@
               <w:right w:w="140" w:type="dxa"/>
             </w:tcMar>
           </w:tcPr>
-          <w:p>
-            <w:r>
-              <w:rPr>
-                <w:sz w:val="20"/>
-                <w:szCs w:val="20"/>
-              </w:rPr>
-              <w:t>CM_TOKEN</w:t>
+          <w:p w14:paraId="07057C880">
+            <w:r>
+              <w:rPr>
+                <w:sz w:val="20"/>
+                <w:szCs w:val="20"/>
+              </w:rPr>
+              <w:t>VRM_USER_BASIC</w:t>
             </w:r>
           </w:p>
         </w:tc>
@@ -1046,22 +888,13 @@
               <w:right w:w="140" w:type="dxa"/>
             </w:tcMar>
           </w:tcPr>
-          <w:p>
-            <w:proofErr w:type="spellStart"/>
-            <w:r>
-              <w:rPr>
-                <w:sz w:val="20"/>
-                <w:szCs w:val="20"/>
-              </w:rPr>
-              <w:t>Bitsight</w:t>
-            </w:r>
-            <w:proofErr w:type="spellEnd"/>
-            <w:r>
-              <w:rPr>
-                <w:sz w:val="20"/>
-                <w:szCs w:val="20"/>
-              </w:rPr>
-              <w:t xml:space="preserve"> API token for Continuous Monitoring (CM)-only mode</w:t>
+          <w:p w14:paraId="07057C890">
+            <w:r>
+              <w:rPr>
+                <w:sz w:val="20"/>
+                <w:szCs w:val="20"/>
+              </w:rPr>
+              <w:t xml:space="preserve">Username of a restricted (non-admin) ServiceNow user, used for impersonation in role-based access-control tests</w:t>
             </w:r>
           </w:p>
         </w:tc>
@@ -1070,7 +903,7 @@
         <w:tc>
           <w:tcPr>
             <w:tcW w:w="2200" w:type="dxa"/>
-            <w:shd w:val="clear" w:color="auto" w:fill="FFFFFF"/>
+            <w:shd w:val="clear" w:color="auto" w:fill="F7F9FB"/>
             <w:tcMar>
               <w:top w:w="90" w:type="dxa"/>
               <w:left w:w="140" w:type="dxa"/>
@@ -1084,14 +917,14 @@
                 <w:sz w:val="20"/>
                 <w:szCs w:val="20"/>
               </w:rPr>
-              <w:t>VRM_TOKEN</w:t>
+              <w:t>CM_TOKEN</w:t>
             </w:r>
           </w:p>
         </w:tc>
         <w:tc>
           <w:tcPr>
             <w:tcW w:w="7160" w:type="dxa"/>
-            <w:shd w:val="clear" w:color="auto" w:fill="FFFFFF"/>
+            <w:shd w:val="clear" w:color="auto" w:fill="F7F9FB"/>
             <w:tcMar>
               <w:top w:w="90" w:type="dxa"/>
               <w:left w:w="140" w:type="dxa"/>
@@ -1100,21 +933,12 @@
             </w:tcMar>
           </w:tcPr>
           <w:p>
-            <w:proofErr w:type="spellStart"/>
-            <w:r>
-              <w:rPr>
-                <w:sz w:val="20"/>
-                <w:szCs w:val="20"/>
-              </w:rPr>
-              <w:t>Bitsight</w:t>
-            </w:r>
-            <w:proofErr w:type="spellEnd"/>
-            <w:r>
-              <w:rPr>
-                <w:sz w:val="20"/>
-                <w:szCs w:val="20"/>
-              </w:rPr>
-              <w:t xml:space="preserve"> API token for VRM-only mode</w:t>
+            <w:r>
+              <w:rPr>
+                <w:sz w:val="20"/>
+                <w:szCs w:val="20"/>
+              </w:rPr>
+              <w:t xml:space="preserve">Bitsight API token for Continuous Monitoring (CM)-only mode</w:t>
             </w:r>
           </w:p>
         </w:tc>
@@ -1123,7 +947,7 @@
         <w:tc>
           <w:tcPr>
             <w:tcW w:w="2200" w:type="dxa"/>
-            <w:shd w:val="clear" w:color="auto" w:fill="F7F9FB"/>
+            <w:shd w:val="clear" w:color="auto" w:fill="FFFFFF"/>
             <w:tcMar>
               <w:top w:w="90" w:type="dxa"/>
               <w:left w:w="140" w:type="dxa"/>
@@ -1137,14 +961,14 @@
                 <w:sz w:val="20"/>
                 <w:szCs w:val="20"/>
               </w:rPr>
-              <w:t>CMVRM_TOKEN</w:t>
+              <w:t>VRM_TOKEN</w:t>
             </w:r>
           </w:p>
         </w:tc>
         <w:tc>
           <w:tcPr>
             <w:tcW w:w="7160" w:type="dxa"/>
-            <w:shd w:val="clear" w:color="auto" w:fill="F7F9FB"/>
+            <w:shd w:val="clear" w:color="auto" w:fill="FFFFFF"/>
             <w:tcMar>
               <w:top w:w="90" w:type="dxa"/>
               <w:left w:w="140" w:type="dxa"/>
@@ -1153,21 +977,56 @@
             </w:tcMar>
           </w:tcPr>
           <w:p>
-            <w:proofErr w:type="spellStart"/>
-            <w:r>
-              <w:rPr>
-                <w:sz w:val="20"/>
-                <w:szCs w:val="20"/>
-              </w:rPr>
-              <w:t>Bitsight</w:t>
-            </w:r>
-            <w:proofErr w:type="spellEnd"/>
-            <w:r>
-              <w:rPr>
-                <w:sz w:val="20"/>
-                <w:szCs w:val="20"/>
-              </w:rPr>
-              <w:t xml:space="preserve"> API token for the combined CM + VRM mode</w:t>
+            <w:r>
+              <w:rPr>
+                <w:sz w:val="20"/>
+                <w:szCs w:val="20"/>
+              </w:rPr>
+              <w:t xml:space="preserve">Bitsight API token for VRM-only mode</w:t>
+            </w:r>
+          </w:p>
+        </w:tc>
+      </w:tr>
+      <w:tr>
+        <w:tc>
+          <w:tcPr>
+            <w:tcW w:w="2200" w:type="dxa"/>
+            <w:shd w:val="clear" w:color="auto" w:fill="F7F9FB"/>
+            <w:tcMar>
+              <w:top w:w="90" w:type="dxa"/>
+              <w:left w:w="140" w:type="dxa"/>
+              <w:bottom w:w="90" w:type="dxa"/>
+              <w:right w:w="140" w:type="dxa"/>
+            </w:tcMar>
+          </w:tcPr>
+          <w:p>
+            <w:r>
+              <w:rPr>
+                <w:sz w:val="20"/>
+                <w:szCs w:val="20"/>
+              </w:rPr>
+              <w:t>CMVRM_TOKEN</w:t>
+            </w:r>
+          </w:p>
+        </w:tc>
+        <w:tc>
+          <w:tcPr>
+            <w:tcW w:w="7160" w:type="dxa"/>
+            <w:shd w:val="clear" w:color="auto" w:fill="F7F9FB"/>
+            <w:tcMar>
+              <w:top w:w="90" w:type="dxa"/>
+              <w:left w:w="140" w:type="dxa"/>
+              <w:bottom w:w="90" w:type="dxa"/>
+              <w:right w:w="140" w:type="dxa"/>
+            </w:tcMar>
+          </w:tcPr>
+          <w:p>
+            <w:r>
+              <w:rPr>
+                <w:sz w:val="20"/>
+                <w:szCs w:val="20"/>
+              </w:rPr>
+              <w:t xml:space="preserve">Bitsight API token for the combined CM + VRM mode</w:t>
             </w:r>
           </w:p>
         </w:tc>
@@ -1217,28 +1076,7 @@
               <w:t xml:space="preserve">Note:  </w:t>
             </w:r>
             <w:r>
-              <w:t xml:space="preserve">Never commit your .env file. It contains live credentials and tokens. Make </w:t>
-            </w:r>
-            <w:proofErr w:type="gramStart"/>
-            <w:r>
-              <w:t>sure .env</w:t>
-            </w:r>
-            <w:proofErr w:type="gramEnd"/>
-            <w:r>
-              <w:t xml:space="preserve"> is listed </w:t>
-            </w:r>
-            <w:proofErr w:type="gramStart"/>
-            <w:r>
-              <w:t>in .</w:t>
-            </w:r>
-            <w:proofErr w:type="spellStart"/>
-            <w:r>
-              <w:t>gitignore</w:t>
-            </w:r>
-            <w:proofErr w:type="spellEnd"/>
-            <w:proofErr w:type="gramEnd"/>
-            <w:r>
-              <w:t>.</w:t>
+              <w:t xml:space="preserve">Never commit your .env file. It contains live credentials and tokens. Make sure .env is listed in .gitignore.</w:t>
             </w:r>
           </w:p>
         </w:tc>
@@ -1254,7 +1092,7 @@
         <w:spacing w:after="160" w:line="300" w:lineRule="auto"/>
       </w:pPr>
       <w:r>
-        <w:t>You only need to fill in the token(s) relevant to the test file(s) you intend to run — for example, 04_alerts_import_spec.js needs both CM_TOKEN and CMVRM_TOKEN.</w:t>
+        <w:t>You only need to fill in the token(s) relevant to the test file(s) you intend to run — for example, 04_alerts_import_spec.js needs both CM_TOKEN and CMVRM_TOKEN, while 02_vrm_test_cases_spec.js needs VRM_TOKEN (and VRM_USER_BASIC for its restricted-user access-control tests).</w:t>
       </w:r>
     </w:p>
     <w:p>
@@ -1313,23 +1151,13 @@
             <w:pPr>
               <w:spacing w:after="40"/>
             </w:pPr>
-            <w:proofErr w:type="spellStart"/>
-            <w:r>
-              <w:rPr>
-                <w:rFonts w:ascii="Consolas" w:eastAsia="Consolas" w:hAnsi="Consolas" w:cs="Consolas"/>
-                <w:sz w:val="20"/>
-                <w:szCs w:val="20"/>
-              </w:rPr>
-              <w:t>bs_vrm_playwright</w:t>
-            </w:r>
-            <w:proofErr w:type="spellEnd"/>
-            <w:r>
-              <w:rPr>
-                <w:rFonts w:ascii="Consolas" w:eastAsia="Consolas" w:hAnsi="Consolas" w:cs="Consolas"/>
-                <w:sz w:val="20"/>
-                <w:szCs w:val="20"/>
-              </w:rPr>
-              <w:t>/</w:t>
+            <w:r>
+              <w:rPr>
+                <w:rFonts w:ascii="Consolas" w:eastAsia="Consolas" w:hAnsi="Consolas" w:cs="Consolas"/>
+                <w:sz w:val="20"/>
+                <w:szCs w:val="20"/>
+              </w:rPr>
+              <w:t>bs_vrm_playwright/</w:t>
             </w:r>
           </w:p>
           <w:p>
@@ -1342,27 +1170,7 @@
                 <w:sz w:val="20"/>
                 <w:szCs w:val="20"/>
               </w:rPr>
-              <w:t xml:space="preserve">├── </w:t>
-            </w:r>
-            <w:proofErr w:type="spellStart"/>
-            <w:proofErr w:type="gramStart"/>
-            <w:r>
-              <w:rPr>
-                <w:rFonts w:ascii="Consolas" w:eastAsia="Consolas" w:hAnsi="Consolas" w:cs="Consolas"/>
-                <w:sz w:val="20"/>
-                <w:szCs w:val="20"/>
-              </w:rPr>
-              <w:t>package.json</w:t>
-            </w:r>
-            <w:proofErr w:type="spellEnd"/>
-            <w:proofErr w:type="gramEnd"/>
-            <w:r>
-              <w:rPr>
-                <w:rFonts w:ascii="Consolas" w:eastAsia="Consolas" w:hAnsi="Consolas" w:cs="Consolas"/>
-                <w:sz w:val="20"/>
-                <w:szCs w:val="20"/>
-              </w:rPr>
-              <w:t xml:space="preserve">                 # Project metadata &amp; dependencies</w:t>
+              <w:t xml:space="preserve">├── package.json                 # Project metadata &amp; dependencies</w:t>
             </w:r>
           </w:p>
           <w:p>
@@ -1389,25 +1197,7 @@
                 <w:szCs w:val="20"/>
               </w:rPr>
               <w:lastRenderedPageBreak/>
-              <w:t>├─</w:t>
-            </w:r>
-            <w:proofErr w:type="gramStart"/>
-            <w:r>
-              <w:rPr>
-                <w:rFonts w:ascii="Consolas" w:eastAsia="Consolas" w:hAnsi="Consolas" w:cs="Consolas"/>
-                <w:sz w:val="20"/>
-                <w:szCs w:val="20"/>
-              </w:rPr>
-              <w:t>─ .env</w:t>
-            </w:r>
-            <w:proofErr w:type="gramEnd"/>
-            <w:r>
-              <w:rPr>
-                <w:rFonts w:ascii="Consolas" w:eastAsia="Consolas" w:hAnsi="Consolas" w:cs="Consolas"/>
-                <w:sz w:val="20"/>
-                <w:szCs w:val="20"/>
-              </w:rPr>
-              <w:t xml:space="preserve">                         # Your credentials/tokens (create this)</w:t>
+              <w:t xml:space="preserve">├── .env                         # Your credentials/tokens (create this)</w:t>
             </w:r>
           </w:p>
           <w:p>
@@ -1420,25 +1210,7 @@
                 <w:sz w:val="20"/>
                 <w:szCs w:val="20"/>
               </w:rPr>
-              <w:t>├── playwright/.auth/</w:t>
-            </w:r>
-            <w:proofErr w:type="spellStart"/>
-            <w:r>
-              <w:rPr>
-                <w:rFonts w:ascii="Consolas" w:eastAsia="Consolas" w:hAnsi="Consolas" w:cs="Consolas"/>
-                <w:sz w:val="20"/>
-                <w:szCs w:val="20"/>
-              </w:rPr>
-              <w:t>user.json</w:t>
-            </w:r>
-            <w:proofErr w:type="spellEnd"/>
-            <w:r>
-              <w:rPr>
-                <w:rFonts w:ascii="Consolas" w:eastAsia="Consolas" w:hAnsi="Consolas" w:cs="Consolas"/>
-                <w:sz w:val="20"/>
-                <w:szCs w:val="20"/>
-              </w:rPr>
-              <w:t xml:space="preserve">   # Saved login session (auto-generated)</w:t>
+              <w:t xml:space="preserve">├── playwright/.auth/user.json   # Saved login session (auto-generated)</w:t>
             </w:r>
           </w:p>
           <w:p>
@@ -1493,7 +1265,7 @@
               <w:t xml:space="preserve">    ├── 01_cm_test_cases_spec.js   # CM-mode tests</w:t>
             </w:r>
           </w:p>
-          <w:p>
+          <w:p w14:paraId="07057CA00">
             <w:pPr>
               <w:spacing w:after="40"/>
             </w:pPr>
@@ -1503,7 +1275,7 @@
                 <w:sz w:val="20"/>
                 <w:szCs w:val="20"/>
               </w:rPr>
-              <w:t xml:space="preserve">    ├── 03_cm_vrm_token_spec.js    # CM+VRM-mode tests</w:t>
+              <w:t xml:space="preserve">    ├── 02_vrm_test_cases_spec.js  # VRM-mode tests</w:t>
             </w:r>
           </w:p>
           <w:p>
@@ -1516,6 +1288,19 @@
                 <w:sz w:val="20"/>
                 <w:szCs w:val="20"/>
               </w:rPr>
+              <w:t xml:space="preserve">    ├── 03_cm_vrm_token_spec.js    # CM+VRM-mode tests</w:t>
+            </w:r>
+          </w:p>
+          <w:p>
+            <w:pPr>
+              <w:spacing w:after="40"/>
+            </w:pPr>
+            <w:r>
+              <w:rPr>
+                <w:rFonts w:ascii="Consolas" w:eastAsia="Consolas" w:hAnsi="Consolas" w:cs="Consolas"/>
+                <w:sz w:val="20"/>
+                <w:szCs w:val="20"/>
+              </w:rPr>
               <w:t xml:space="preserve">    ├── 04_alerts_import_spec.js   # Alerts &amp; incident tests</w:t>
             </w:r>
           </w:p>
@@ -1542,23 +1327,7 @@
         <w:spacing w:after="160" w:line="300" w:lineRule="auto"/>
       </w:pPr>
       <w:r>
-        <w:t xml:space="preserve">playwright.config.js points </w:t>
-      </w:r>
-      <w:proofErr w:type="spellStart"/>
-      <w:r>
-        <w:t>testDir</w:t>
-      </w:r>
-      <w:proofErr w:type="spellEnd"/>
-      <w:r>
-        <w:t xml:space="preserve"> </w:t>
-      </w:r>
-      <w:proofErr w:type="gramStart"/>
-      <w:r>
-        <w:t>at .</w:t>
-      </w:r>
-      <w:proofErr w:type="gramEnd"/>
-      <w:r>
-        <w:t>/tests, so all spec files must live there (alongside the shared utils/ folder they import from).</w:t>
+        <w:t xml:space="preserve">playwright.config.js points testDir at ./tests, so all spec files must live there (alongside the shared utils/ folder they import from).</w:t>
       </w:r>
     </w:p>
     <w:p>
@@ -1598,23 +1367,7 @@
         <w:spacing w:after="100"/>
       </w:pPr>
       <w:r>
-        <w:t xml:space="preserve">A "setup" project matches only login_setup.spec.js. It logs into ServiceNow once with the credentials </w:t>
-      </w:r>
-      <w:proofErr w:type="gramStart"/>
-      <w:r>
-        <w:t>from .env</w:t>
-      </w:r>
-      <w:proofErr w:type="gramEnd"/>
-      <w:r>
-        <w:t xml:space="preserve"> and saves the resulting session to playwright/.auth/</w:t>
-      </w:r>
-      <w:proofErr w:type="spellStart"/>
-      <w:r>
-        <w:t>user.json</w:t>
-      </w:r>
-      <w:proofErr w:type="spellEnd"/>
-      <w:r>
-        <w:t>.</w:t>
+        <w:t xml:space="preserve">A "setup" project matches only login_setup.spec.js. It logs into ServiceNow once with the credentials from .env and saves the resulting session to playwright/.auth/user.json.</w:t>
       </w:r>
     </w:p>
     <w:p>
@@ -1627,25 +1380,7 @@
         <w:spacing w:after="100"/>
       </w:pPr>
       <w:r>
-        <w:t xml:space="preserve">The "chromium" project declares dependencies: ['setup'], so Playwright always runs the setup project first, then reuses the saved </w:t>
-      </w:r>
-      <w:proofErr w:type="spellStart"/>
-      <w:r>
-        <w:t>storageState</w:t>
-      </w:r>
-      <w:proofErr w:type="spellEnd"/>
-      <w:r>
-        <w:t xml:space="preserve"> for every real test. It also uses </w:t>
-      </w:r>
-      <w:proofErr w:type="spellStart"/>
-      <w:proofErr w:type="gramStart"/>
-      <w:r>
-        <w:t>testIgnore</w:t>
-      </w:r>
-      <w:proofErr w:type="spellEnd"/>
-      <w:proofErr w:type="gramEnd"/>
-      <w:r>
-        <w:t xml:space="preserve"> so the login spec itself is never re-run as a normal test.</w:t>
+        <w:t xml:space="preserve">The "chromium" project declares dependencies: ['setup'], so Playwright always runs the setup project first, then reuses the saved storageState for every real test. It also uses testIgnore so the login spec itself is never re-run as a normal test.</w:t>
       </w:r>
     </w:p>
     <w:p>
@@ -1658,15 +1393,7 @@
         <w:spacing w:after="160" w:line="300" w:lineRule="auto"/>
       </w:pPr>
       <w:r>
-        <w:t xml:space="preserve">In short: just run </w:t>
-      </w:r>
-      <w:proofErr w:type="spellStart"/>
-      <w:r>
-        <w:t>npx</w:t>
-      </w:r>
-      <w:proofErr w:type="spellEnd"/>
-      <w:r>
-        <w:t xml:space="preserve"> playwright test (see below) and the login happens automatically before anything else — you never need to run it manually. Firefox and WebKit projects are pre-wired in the config but currently commented out; uncomment them if you want cross-browser coverage.</w:t>
+        <w:t xml:space="preserve">In short: just run npx playwright test (see below) and the login happens automatically before anything else — you never need to run it manually. Firefox and WebKit projects are pre-wired in the config but currently commented out; uncomment them if you want cross-browser coverage.</w:t>
       </w:r>
     </w:p>
     <w:p>
@@ -1734,57 +1461,8 @@
               </w:rPr>
               <w:t xml:space="preserve">Note:  </w:t>
             </w:r>
-            <w:proofErr w:type="spellStart"/>
-            <w:proofErr w:type="gramStart"/>
-            <w:r>
-              <w:t>package.json</w:t>
-            </w:r>
-            <w:proofErr w:type="spellEnd"/>
-            <w:proofErr w:type="gramEnd"/>
-            <w:r>
-              <w:t xml:space="preserve"> doesn’t define </w:t>
-            </w:r>
-            <w:proofErr w:type="gramStart"/>
-            <w:r>
-              <w:t>an</w:t>
-            </w:r>
-            <w:proofErr w:type="gramEnd"/>
-            <w:r>
-              <w:t xml:space="preserve"> </w:t>
-            </w:r>
-            <w:proofErr w:type="spellStart"/>
-            <w:r>
-              <w:t>npm</w:t>
-            </w:r>
-            <w:proofErr w:type="spellEnd"/>
-            <w:r>
-              <w:t xml:space="preserve"> test script yet, so use the </w:t>
-            </w:r>
-            <w:proofErr w:type="spellStart"/>
-            <w:r>
-              <w:t>npx</w:t>
-            </w:r>
-            <w:proofErr w:type="spellEnd"/>
-            <w:r>
-              <w:t xml:space="preserve"> playwright test commands below directly. (Optional: add "test": "playwright test" to the scripts block in </w:t>
-            </w:r>
-            <w:proofErr w:type="spellStart"/>
-            <w:proofErr w:type="gramStart"/>
-            <w:r>
-              <w:t>package.json</w:t>
-            </w:r>
-            <w:proofErr w:type="spellEnd"/>
-            <w:proofErr w:type="gramEnd"/>
-            <w:r>
-              <w:t xml:space="preserve"> if you’d like to just run </w:t>
-            </w:r>
-            <w:proofErr w:type="spellStart"/>
-            <w:r>
-              <w:t>npm</w:t>
-            </w:r>
-            <w:proofErr w:type="spellEnd"/>
-            <w:r>
-              <w:t xml:space="preserve"> test.)</w:t>
+            <w:r>
+              <w:t xml:space="preserve">package.json doesn’t define an npm test script yet, so use the npx playwright test commands below directly. (Optional: add "test": "playwright test" to the scripts block in package.json if you’d like to just run npm test.)</w:t>
             </w:r>
           </w:p>
         </w:tc>
@@ -1840,23 +1518,13 @@
             </w:tcMar>
           </w:tcPr>
           <w:p>
-            <w:proofErr w:type="spellStart"/>
-            <w:r>
-              <w:rPr>
-                <w:rFonts w:ascii="Consolas" w:eastAsia="Consolas" w:hAnsi="Consolas" w:cs="Consolas"/>
-                <w:sz w:val="20"/>
-                <w:szCs w:val="20"/>
-              </w:rPr>
-              <w:t>npx</w:t>
-            </w:r>
-            <w:proofErr w:type="spellEnd"/>
-            <w:r>
-              <w:rPr>
-                <w:rFonts w:ascii="Consolas" w:eastAsia="Consolas" w:hAnsi="Consolas" w:cs="Consolas"/>
-                <w:sz w:val="20"/>
-                <w:szCs w:val="20"/>
-              </w:rPr>
-              <w:t xml:space="preserve"> playwright test</w:t>
+            <w:r>
+              <w:rPr>
+                <w:rFonts w:ascii="Consolas" w:eastAsia="Consolas" w:hAnsi="Consolas" w:cs="Consolas"/>
+                <w:sz w:val="20"/>
+                <w:szCs w:val="20"/>
+              </w:rPr>
+              <w:t xml:space="preserve">npx playwright test</w:t>
             </w:r>
           </w:p>
         </w:tc>
@@ -1908,23 +1576,13 @@
             </w:tcMar>
           </w:tcPr>
           <w:p>
-            <w:proofErr w:type="spellStart"/>
-            <w:r>
-              <w:rPr>
-                <w:rFonts w:ascii="Consolas" w:eastAsia="Consolas" w:hAnsi="Consolas" w:cs="Consolas"/>
-                <w:sz w:val="20"/>
-                <w:szCs w:val="20"/>
-              </w:rPr>
-              <w:t>npx</w:t>
-            </w:r>
-            <w:proofErr w:type="spellEnd"/>
-            <w:r>
-              <w:rPr>
-                <w:rFonts w:ascii="Consolas" w:eastAsia="Consolas" w:hAnsi="Consolas" w:cs="Consolas"/>
-                <w:sz w:val="20"/>
-                <w:szCs w:val="20"/>
-              </w:rPr>
-              <w:t xml:space="preserve"> playwright test 01_cm_test_cases_spec.js</w:t>
+            <w:r>
+              <w:rPr>
+                <w:rFonts w:ascii="Consolas" w:eastAsia="Consolas" w:hAnsi="Consolas" w:cs="Consolas"/>
+                <w:sz w:val="20"/>
+                <w:szCs w:val="20"/>
+              </w:rPr>
+              <w:t xml:space="preserve">npx playwright test 01_cm_test_cases_spec.js</w:t>
             </w:r>
           </w:p>
         </w:tc>
@@ -1975,41 +1633,13 @@
             </w:tcMar>
           </w:tcPr>
           <w:p>
-            <w:proofErr w:type="spellStart"/>
-            <w:r>
-              <w:rPr>
-                <w:rFonts w:ascii="Consolas" w:eastAsia="Consolas" w:hAnsi="Consolas" w:cs="Consolas"/>
-                <w:sz w:val="20"/>
-                <w:szCs w:val="20"/>
-              </w:rPr>
-              <w:t>npx</w:t>
-            </w:r>
-            <w:proofErr w:type="spellEnd"/>
-            <w:r>
-              <w:rPr>
-                <w:rFonts w:ascii="Consolas" w:eastAsia="Consolas" w:hAnsi="Consolas" w:cs="Consolas"/>
-                <w:sz w:val="20"/>
-                <w:szCs w:val="20"/>
-              </w:rPr>
-              <w:t xml:space="preserve"> playwright test -g "TC 002 </w:t>
-            </w:r>
-            <w:proofErr w:type="spellStart"/>
-            <w:r>
-              <w:rPr>
-                <w:rFonts w:ascii="Consolas" w:eastAsia="Consolas" w:hAnsi="Consolas" w:cs="Consolas"/>
-                <w:sz w:val="20"/>
-                <w:szCs w:val="20"/>
-              </w:rPr>
-              <w:t>Bitsight</w:t>
-            </w:r>
-            <w:proofErr w:type="spellEnd"/>
-            <w:r>
-              <w:rPr>
-                <w:rFonts w:ascii="Consolas" w:eastAsia="Consolas" w:hAnsi="Consolas" w:cs="Consolas"/>
-                <w:sz w:val="20"/>
-                <w:szCs w:val="20"/>
-              </w:rPr>
-              <w:t xml:space="preserve"> token validation"</w:t>
+            <w:r>
+              <w:rPr>
+                <w:rFonts w:ascii="Consolas" w:eastAsia="Consolas" w:hAnsi="Consolas" w:cs="Consolas"/>
+                <w:sz w:val="20"/>
+                <w:szCs w:val="20"/>
+              </w:rPr>
+              <w:t xml:space="preserve">npx playwright test -g "TC 002 Bitsight token validation"</w:t>
             </w:r>
           </w:p>
         </w:tc>
@@ -2060,23 +1690,13 @@
             </w:tcMar>
           </w:tcPr>
           <w:p>
-            <w:proofErr w:type="spellStart"/>
-            <w:r>
-              <w:rPr>
-                <w:rFonts w:ascii="Consolas" w:eastAsia="Consolas" w:hAnsi="Consolas" w:cs="Consolas"/>
-                <w:sz w:val="20"/>
-                <w:szCs w:val="20"/>
-              </w:rPr>
-              <w:t>npx</w:t>
-            </w:r>
-            <w:proofErr w:type="spellEnd"/>
-            <w:r>
-              <w:rPr>
-                <w:rFonts w:ascii="Consolas" w:eastAsia="Consolas" w:hAnsi="Consolas" w:cs="Consolas"/>
-                <w:sz w:val="20"/>
-                <w:szCs w:val="20"/>
-              </w:rPr>
-              <w:t xml:space="preserve"> playwright test --headed</w:t>
+            <w:r>
+              <w:rPr>
+                <w:rFonts w:ascii="Consolas" w:eastAsia="Consolas" w:hAnsi="Consolas" w:cs="Consolas"/>
+                <w:sz w:val="20"/>
+                <w:szCs w:val="20"/>
+              </w:rPr>
+              <w:t xml:space="preserve">npx playwright test --headed</w:t>
             </w:r>
           </w:p>
         </w:tc>
@@ -2135,34 +1755,14 @@
             </w:tcMar>
           </w:tcPr>
           <w:p>
-            <w:proofErr w:type="spellStart"/>
-            <w:r>
-              <w:rPr>
-                <w:rFonts w:ascii="Consolas" w:eastAsia="Consolas" w:hAnsi="Consolas" w:cs="Consolas"/>
-                <w:sz w:val="20"/>
-                <w:szCs w:val="20"/>
-              </w:rPr>
-              <w:t>npx</w:t>
-            </w:r>
-            <w:proofErr w:type="spellEnd"/>
-            <w:r>
-              <w:rPr>
-                <w:rFonts w:ascii="Consolas" w:eastAsia="Consolas" w:hAnsi="Consolas" w:cs="Consolas"/>
-                <w:sz w:val="20"/>
-                <w:szCs w:val="20"/>
-              </w:rPr>
-              <w:t xml:space="preserve"> playwright test --</w:t>
-            </w:r>
-            <w:proofErr w:type="spellStart"/>
-            <w:r>
-              <w:rPr>
-                <w:rFonts w:ascii="Consolas" w:eastAsia="Consolas" w:hAnsi="Consolas" w:cs="Consolas"/>
-                <w:sz w:val="20"/>
-                <w:szCs w:val="20"/>
-              </w:rPr>
-              <w:t>ui</w:t>
-            </w:r>
-            <w:proofErr w:type="spellEnd"/>
+            <w:r>
+              <w:rPr>
+                <w:rFonts w:ascii="Consolas" w:eastAsia="Consolas" w:hAnsi="Consolas" w:cs="Consolas"/>
+                <w:sz w:val="20"/>
+                <w:szCs w:val="20"/>
+              </w:rPr>
+              <w:t xml:space="preserve">npx playwright test --ui</w:t>
+            </w:r>
           </w:p>
         </w:tc>
       </w:tr>
@@ -2212,23 +1812,13 @@
             </w:tcMar>
           </w:tcPr>
           <w:p>
-            <w:proofErr w:type="spellStart"/>
-            <w:r>
-              <w:rPr>
-                <w:rFonts w:ascii="Consolas" w:eastAsia="Consolas" w:hAnsi="Consolas" w:cs="Consolas"/>
-                <w:sz w:val="20"/>
-                <w:szCs w:val="20"/>
-              </w:rPr>
-              <w:t>npx</w:t>
-            </w:r>
-            <w:proofErr w:type="spellEnd"/>
-            <w:r>
-              <w:rPr>
-                <w:rFonts w:ascii="Consolas" w:eastAsia="Consolas" w:hAnsi="Consolas" w:cs="Consolas"/>
-                <w:sz w:val="20"/>
-                <w:szCs w:val="20"/>
-              </w:rPr>
-              <w:t xml:space="preserve"> playwright test 04_alerts_import_spec.js --debug</w:t>
+            <w:r>
+              <w:rPr>
+                <w:rFonts w:ascii="Consolas" w:eastAsia="Consolas" w:hAnsi="Consolas" w:cs="Consolas"/>
+                <w:sz w:val="20"/>
+                <w:szCs w:val="20"/>
+              </w:rPr>
+              <w:t xml:space="preserve">npx playwright test 04_alerts_import_spec.js --debug</w:t>
             </w:r>
           </w:p>
         </w:tc>
@@ -2279,23 +1869,13 @@
             </w:tcMar>
           </w:tcPr>
           <w:p>
-            <w:proofErr w:type="spellStart"/>
-            <w:r>
-              <w:rPr>
-                <w:rFonts w:ascii="Consolas" w:eastAsia="Consolas" w:hAnsi="Consolas" w:cs="Consolas"/>
-                <w:sz w:val="20"/>
-                <w:szCs w:val="20"/>
-              </w:rPr>
-              <w:t>npx</w:t>
-            </w:r>
-            <w:proofErr w:type="spellEnd"/>
-            <w:r>
-              <w:rPr>
-                <w:rFonts w:ascii="Consolas" w:eastAsia="Consolas" w:hAnsi="Consolas" w:cs="Consolas"/>
-                <w:sz w:val="20"/>
-                <w:szCs w:val="20"/>
-              </w:rPr>
-              <w:t xml:space="preserve"> playwright test --last-failed</w:t>
+            <w:r>
+              <w:rPr>
+                <w:rFonts w:ascii="Consolas" w:eastAsia="Consolas" w:hAnsi="Consolas" w:cs="Consolas"/>
+                <w:sz w:val="20"/>
+                <w:szCs w:val="20"/>
+              </w:rPr>
+              <w:t xml:space="preserve">npx playwright test --last-failed</w:t>
             </w:r>
           </w:p>
         </w:tc>
@@ -2362,23 +1942,13 @@
             </w:tcMar>
           </w:tcPr>
           <w:p>
-            <w:proofErr w:type="spellStart"/>
-            <w:r>
-              <w:rPr>
-                <w:rFonts w:ascii="Consolas" w:eastAsia="Consolas" w:hAnsi="Consolas" w:cs="Consolas"/>
-                <w:sz w:val="20"/>
-                <w:szCs w:val="20"/>
-              </w:rPr>
-              <w:t>npx</w:t>
-            </w:r>
-            <w:proofErr w:type="spellEnd"/>
-            <w:r>
-              <w:rPr>
-                <w:rFonts w:ascii="Consolas" w:eastAsia="Consolas" w:hAnsi="Consolas" w:cs="Consolas"/>
-                <w:sz w:val="20"/>
-                <w:szCs w:val="20"/>
-              </w:rPr>
-              <w:t xml:space="preserve"> playwright show-report</w:t>
+            <w:r>
+              <w:rPr>
+                <w:rFonts w:ascii="Consolas" w:eastAsia="Consolas" w:hAnsi="Consolas" w:cs="Consolas"/>
+                <w:sz w:val="20"/>
+                <w:szCs w:val="20"/>
+              </w:rPr>
+              <w:t xml:space="preserve">npx playwright show-report</w:t>
             </w:r>
           </w:p>
         </w:tc>
@@ -2428,23 +1998,13 @@
             </w:tcMar>
           </w:tcPr>
           <w:p>
-            <w:proofErr w:type="spellStart"/>
-            <w:r>
-              <w:rPr>
-                <w:rFonts w:ascii="Consolas" w:eastAsia="Consolas" w:hAnsi="Consolas" w:cs="Consolas"/>
-                <w:sz w:val="20"/>
-                <w:szCs w:val="20"/>
-              </w:rPr>
-              <w:t>npx</w:t>
-            </w:r>
-            <w:proofErr w:type="spellEnd"/>
-            <w:r>
-              <w:rPr>
-                <w:rFonts w:ascii="Consolas" w:eastAsia="Consolas" w:hAnsi="Consolas" w:cs="Consolas"/>
-                <w:sz w:val="20"/>
-                <w:szCs w:val="20"/>
-              </w:rPr>
-              <w:t xml:space="preserve"> playwright show-trace trace.zip</w:t>
+            <w:r>
+              <w:rPr>
+                <w:rFonts w:ascii="Consolas" w:eastAsia="Consolas" w:hAnsi="Consolas" w:cs="Consolas"/>
+                <w:sz w:val="20"/>
+                <w:szCs w:val="20"/>
+              </w:rPr>
+              <w:t xml:space="preserve">npx playwright show-trace trace.zip</w:t>
             </w:r>
           </w:p>
         </w:tc>
@@ -2630,32 +2190,16 @@
                 <w:sz w:val="20"/>
                 <w:szCs w:val="20"/>
               </w:rPr>
-              <w:t xml:space="preserve">CM-only token validation, portfolio import reconciliation against the live </w:t>
-            </w:r>
-            <w:proofErr w:type="spellStart"/>
-            <w:r>
-              <w:rPr>
-                <w:sz w:val="20"/>
-                <w:szCs w:val="20"/>
-              </w:rPr>
-              <w:t>Bitsight</w:t>
-            </w:r>
-            <w:proofErr w:type="spellEnd"/>
-            <w:r>
-              <w:rPr>
-                <w:sz w:val="20"/>
-                <w:szCs w:val="20"/>
-              </w:rPr>
-              <w:t xml:space="preserve"> API, subscription/folder management, assessment reports, and role-based (restricted user) access control</w:t>
+              <w:t xml:space="preserve">CM-only token validation, portfolio import reconciliation against the live Bitsight API, subscription/folder management, assessment reports, and role-based (restricted user) access control</w:t>
             </w:r>
           </w:p>
         </w:tc>
       </w:tr>
-      <w:tr>
+      <w:tr w14:paraId="07057CE20">
         <w:tc>
           <w:tcPr>
             <w:tcW w:w="2600" w:type="dxa"/>
-            <w:shd w:val="clear" w:color="auto" w:fill="FFFFFF"/>
+            <w:shd w:val="clear" w:color="auto" w:fill="F7F9FB"/>
             <w:tcMar>
               <w:top w:w="90" w:type="dxa"/>
               <w:left w:w="140" w:type="dxa"/>
@@ -2663,20 +2207,20 @@
               <w:right w:w="140" w:type="dxa"/>
             </w:tcMar>
           </w:tcPr>
-          <w:p>
-            <w:r>
-              <w:rPr>
-                <w:sz w:val="20"/>
-                <w:szCs w:val="20"/>
-              </w:rPr>
-              <w:t>03_cm_vrm_token_spec.js</w:t>
+          <w:p w14:paraId="07057CE00">
+            <w:r>
+              <w:rPr>
+                <w:sz w:val="20"/>
+                <w:szCs w:val="20"/>
+              </w:rPr>
+              <w:t>02_vrm_test_cases_spec.js</w:t>
             </w:r>
           </w:p>
         </w:tc>
         <w:tc>
           <w:tcPr>
             <w:tcW w:w="6760" w:type="dxa"/>
-            <w:shd w:val="clear" w:color="auto" w:fill="FFFFFF"/>
+            <w:shd w:val="clear" w:color="auto" w:fill="F7F9FB"/>
             <w:tcMar>
               <w:top w:w="90" w:type="dxa"/>
               <w:left w:w="140" w:type="dxa"/>
@@ -2684,13 +2228,13 @@
               <w:right w:w="140" w:type="dxa"/>
             </w:tcMar>
           </w:tcPr>
-          <w:p>
-            <w:r>
-              <w:rPr>
-                <w:sz w:val="20"/>
-                <w:szCs w:val="20"/>
-              </w:rPr>
-              <w:t>Combined CM+VRM token validation, module reachability, company-matching/insert/mark-as-vendor import flags, and record layout differences between CM-only, VRM-only, and CM+VRM companies</w:t>
+          <w:p w14:paraId="07057CE10">
+            <w:r>
+              <w:rPr>
+                <w:sz w:val="20"/>
+                <w:szCs w:val="20"/>
+              </w:rPr>
+              <w:t xml:space="preserve">VRM-only token validation; portfolio import completeness reconciliation plus a 15-record field-by-field sample against the live Bitsight API; VRM-only record tab/card layout and Portfolio Information field checks; unmatched-company insert and mark-as-vendor import flag behavior; and role-based (restricted user) access control (write-protected security rating field, hidden Application Configuration/Scheduled Data Imports, Dashboard access)</w:t>
             </w:r>
           </w:p>
         </w:tc>
@@ -2699,7 +2243,7 @@
         <w:tc>
           <w:tcPr>
             <w:tcW w:w="2600" w:type="dxa"/>
-            <w:shd w:val="clear" w:color="auto" w:fill="F7F9FB"/>
+            <w:shd w:val="clear" w:color="auto" w:fill="FFFFFF"/>
             <w:tcMar>
               <w:top w:w="90" w:type="dxa"/>
               <w:left w:w="140" w:type="dxa"/>
@@ -2713,14 +2257,14 @@
                 <w:sz w:val="20"/>
                 <w:szCs w:val="20"/>
               </w:rPr>
-              <w:t>04_alerts_import_spec.js</w:t>
+              <w:t>03_cm_vrm_token_spec.js</w:t>
             </w:r>
           </w:p>
         </w:tc>
         <w:tc>
           <w:tcPr>
             <w:tcW w:w="6760" w:type="dxa"/>
-            <w:shd w:val="clear" w:color="auto" w:fill="F7F9FB"/>
+            <w:shd w:val="clear" w:color="auto" w:fill="FFFFFF"/>
             <w:tcMar>
               <w:top w:w="90" w:type="dxa"/>
               <w:left w:w="140" w:type="dxa"/>
@@ -2734,6 +2278,50 @@
                 <w:sz w:val="20"/>
                 <w:szCs w:val="20"/>
               </w:rPr>
+              <w:t>Combined CM+VRM token validation, module reachability, company-matching/insert/mark-as-vendor import flags, and record layout differences between CM-only, VRM-only, and CM+VRM companies</w:t>
+            </w:r>
+          </w:p>
+        </w:tc>
+      </w:tr>
+      <w:tr>
+        <w:tc>
+          <w:tcPr>
+            <w:tcW w:w="2600" w:type="dxa"/>
+            <w:shd w:val="clear" w:color="auto" w:fill="F7F9FB"/>
+            <w:tcMar>
+              <w:top w:w="90" w:type="dxa"/>
+              <w:left w:w="140" w:type="dxa"/>
+              <w:bottom w:w="90" w:type="dxa"/>
+              <w:right w:w="140" w:type="dxa"/>
+            </w:tcMar>
+          </w:tcPr>
+          <w:p>
+            <w:r>
+              <w:rPr>
+                <w:sz w:val="20"/>
+                <w:szCs w:val="20"/>
+              </w:rPr>
+              <w:t>04_alerts_import_spec.js</w:t>
+            </w:r>
+          </w:p>
+        </w:tc>
+        <w:tc>
+          <w:tcPr>
+            <w:tcW w:w="6760" w:type="dxa"/>
+            <w:shd w:val="clear" w:color="auto" w:fill="F7F9FB"/>
+            <w:tcMar>
+              <w:top w:w="90" w:type="dxa"/>
+              <w:left w:w="140" w:type="dxa"/>
+              <w:bottom w:w="90" w:type="dxa"/>
+              <w:right w:w="140" w:type="dxa"/>
+            </w:tcMar>
+          </w:tcPr>
+          <w:p>
+            <w:r>
+              <w:rPr>
+                <w:sz w:val="20"/>
+                <w:szCs w:val="20"/>
+              </w:rPr>
               <w:t>Alerts import reconciliation and the incident-creation business rules (Critical/Warn severity, Public Disclosure, Security Rating score drops) for both Type 1 (CM) and Type 3 (CM+VRM) tokens</w:t>
             </w:r>
           </w:p>
@@ -2750,23 +2338,7 @@
         <w:spacing w:after="160" w:line="300" w:lineRule="auto"/>
       </w:pPr>
       <w:r>
-        <w:t xml:space="preserve">Tests validate not just the </w:t>
-      </w:r>
-      <w:proofErr w:type="gramStart"/>
-      <w:r>
-        <w:t>UI, but</w:t>
-      </w:r>
-      <w:proofErr w:type="gramEnd"/>
-      <w:r>
-        <w:t xml:space="preserve"> cross-check the data ServiceNow displays against ground truth pulled directly from the </w:t>
-      </w:r>
-      <w:proofErr w:type="spellStart"/>
-      <w:r>
-        <w:t>Bitsight</w:t>
-      </w:r>
-      <w:proofErr w:type="spellEnd"/>
-      <w:r>
-        <w:t xml:space="preserve"> and ServiceNow REST APIs, using the shared helpers in utils/.</w:t>
+        <w:t xml:space="preserve">Tests validate not just the UI, but cross-check the data ServiceNow displays against ground truth pulled directly from the Bitsight and ServiceNow REST APIs, using the shared helpers in utils/.</w:t>
       </w:r>
     </w:p>
     <w:p>
@@ -2801,15 +2373,7 @@
         <w:spacing w:after="100"/>
       </w:pPr>
       <w:r>
-        <w:t xml:space="preserve">Login step times out — double-check SN_URL, SN_USER, and SN_PASS </w:t>
-      </w:r>
-      <w:proofErr w:type="gramStart"/>
-      <w:r>
-        <w:t>in .env</w:t>
-      </w:r>
-      <w:proofErr w:type="gramEnd"/>
-      <w:r>
-        <w:t>; the instance may also just be slow to wake up (the login spec already allows up to 60s).</w:t>
+        <w:t xml:space="preserve">Login step times out — double-check SN_URL, SN_USER, and SN_PASS in .env; the instance may also just be slow to wake up (the login spec already allows up to 60s).</w:t>
       </w:r>
     </w:p>
     <w:p>
@@ -2822,15 +2386,7 @@
         <w:spacing w:after="100"/>
       </w:pPr>
       <w:r>
-        <w:t xml:space="preserve">Token validation fails — confirm the relevant token (CM_TOKEN / VRM_TOKEN / CMVRM_TOKEN) is valid and hasn’t expired in </w:t>
-      </w:r>
-      <w:proofErr w:type="spellStart"/>
-      <w:r>
-        <w:t>Bitsight</w:t>
-      </w:r>
-      <w:proofErr w:type="spellEnd"/>
-      <w:r>
-        <w:t>.</w:t>
+        <w:t xml:space="preserve">Token validation fails — confirm the relevant token (CM_TOKEN / VRM_TOKEN / CMVRM_TOKEN) is valid and hasn’t expired in Bitsight.</w:t>
       </w:r>
     </w:p>
     <w:p>
@@ -2843,15 +2399,7 @@
         <w:spacing w:after="100"/>
       </w:pPr>
       <w:r>
-        <w:t xml:space="preserve">"CM_TOKEN must be set..." assertion error — the test explicitly requires that token and won’t fall back to another one; add it </w:t>
-      </w:r>
-      <w:proofErr w:type="gramStart"/>
-      <w:r>
-        <w:t>to .env</w:t>
-      </w:r>
-      <w:proofErr w:type="gramEnd"/>
-      <w:r>
-        <w:t>.</w:t>
+        <w:t xml:space="preserve">"CM_TOKEN must be set..." assertion error — the test explicitly requires that token and won’t fall back to another one; add it to .env.</w:t>
       </w:r>
     </w:p>
     <w:p>
@@ -2864,15 +2412,7 @@
         <w:spacing w:after="100"/>
       </w:pPr>
       <w:r>
-        <w:t xml:space="preserve">Browsers not found — run </w:t>
-      </w:r>
-      <w:proofErr w:type="spellStart"/>
-      <w:r>
-        <w:t>npx</w:t>
-      </w:r>
-      <w:proofErr w:type="spellEnd"/>
-      <w:r>
-        <w:t xml:space="preserve"> playwright install again.</w:t>
+        <w:t xml:space="preserve">Browsers not found — run npx playwright install again.</w:t>
       </w:r>
     </w:p>
     <w:p>

</xml_diff>